<commit_message>
File change - v0.1.68 log file
</commit_message>
<xml_diff>
--- a/docs/ChatGPT/_End_of_Chat.docx
+++ b/docs/ChatGPT/_End_of_Chat.docx
@@ -49,8 +49,240 @@
     </w:p>
     <w:p>
       <w:r>
+        <w:t xml:space="preserve">Remember, </w:t>
+      </w:r>
+      <w:r>
+        <w:t xml:space="preserve">A future ChatGPT doesn't need a diary. It needs a </w:t>
+      </w:r>
+      <w:r>
+        <w:rPr>
+          <w:b/>
+          <w:bCs/>
+        </w:rPr>
+        <w:t>developer bootstrap</w:t>
+      </w:r>
+      <w:r>
+        <w:t>.</w:t>
+      </w:r>
+    </w:p>
+    <w:p>
+      <w:r>
+        <w:t>You</w:t>
+      </w:r>
+      <w:r>
+        <w:t xml:space="preserve"> want the Handoff to answer one question:</w:t>
+      </w:r>
+    </w:p>
+    <w:p>
+      <w:r>
+        <w:rPr>
+          <w:b/>
+          <w:bCs/>
+        </w:rPr>
+        <w:t>"If I had never seen this project before, what do I need to know to continue coding correctly in the next 30 minutes?"</w:t>
+      </w:r>
+    </w:p>
+    <w:p>
+      <w:r>
+        <w:t>So include things like:</w:t>
+      </w:r>
+    </w:p>
+    <w:p>
+      <w:pPr>
+        <w:numPr>
+          <w:ilvl w:val="0"/>
+          <w:numId w:val="49"/>
+        </w:numPr>
+      </w:pPr>
+      <w:r>
+        <w:t xml:space="preserve">Current implementation milestone. </w:t>
+      </w:r>
+    </w:p>
+    <w:p>
+      <w:pPr>
+        <w:numPr>
+          <w:ilvl w:val="0"/>
+          <w:numId w:val="49"/>
+        </w:numPr>
+      </w:pPr>
+      <w:r>
+        <w:t xml:space="preserve">What was completed this chat. </w:t>
+      </w:r>
+    </w:p>
+    <w:p>
+      <w:pPr>
+        <w:numPr>
+          <w:ilvl w:val="0"/>
+          <w:numId w:val="49"/>
+        </w:numPr>
+      </w:pPr>
+      <w:r>
+        <w:t xml:space="preserve">What is now considered settled architecture (only decisions that are effectively "law" now). </w:t>
+      </w:r>
+    </w:p>
+    <w:p>
+      <w:pPr>
+        <w:numPr>
+          <w:ilvl w:val="0"/>
+          <w:numId w:val="49"/>
+        </w:numPr>
+      </w:pPr>
+      <w:r>
+        <w:t xml:space="preserve">Current Supabase/Appsmith implementation state. </w:t>
+      </w:r>
+    </w:p>
+    <w:p>
+      <w:pPr>
+        <w:numPr>
+          <w:ilvl w:val="0"/>
+          <w:numId w:val="49"/>
+        </w:numPr>
+      </w:pPr>
+      <w:r>
+        <w:t xml:space="preserve">Known technical debt. </w:t>
+      </w:r>
+    </w:p>
+    <w:p>
+      <w:pPr>
+        <w:numPr>
+          <w:ilvl w:val="0"/>
+          <w:numId w:val="49"/>
+        </w:numPr>
+      </w:pPr>
+      <w:r>
+        <w:t xml:space="preserve">Current blocker (if any). </w:t>
+      </w:r>
+    </w:p>
+    <w:p>
+      <w:pPr>
+        <w:numPr>
+          <w:ilvl w:val="0"/>
+          <w:numId w:val="49"/>
+        </w:numPr>
+      </w:pPr>
+      <w:r>
+        <w:t xml:space="preserve">Current assumptions that still require validation. </w:t>
+      </w:r>
+    </w:p>
+    <w:p>
+      <w:pPr>
+        <w:numPr>
+          <w:ilvl w:val="0"/>
+          <w:numId w:val="49"/>
+        </w:numPr>
+      </w:pPr>
+      <w:r>
+        <w:t xml:space="preserve">Exactly which files/documents now exist and which are authoritative. </w:t>
+      </w:r>
+    </w:p>
+    <w:p>
+      <w:pPr>
+        <w:numPr>
+          <w:ilvl w:val="0"/>
+          <w:numId w:val="49"/>
+        </w:numPr>
+      </w:pPr>
+      <w:r>
+        <w:t xml:space="preserve">The recommended reading order (probably Handoff first, then only the supporting docs actually needed). </w:t>
+      </w:r>
+    </w:p>
+    <w:p>
+      <w:pPr>
+        <w:numPr>
+          <w:ilvl w:val="0"/>
+          <w:numId w:val="49"/>
+        </w:numPr>
+      </w:pPr>
+      <w:r>
+        <w:t xml:space="preserve">Immediate next implementation task. </w:t>
+      </w:r>
+    </w:p>
+    <w:p>
+      <w:pPr>
+        <w:numPr>
+          <w:ilvl w:val="0"/>
+          <w:numId w:val="49"/>
+        </w:numPr>
+      </w:pPr>
+      <w:r>
+        <w:t xml:space="preserve">What </w:t>
+      </w:r>
+      <w:r>
+        <w:rPr>
+          <w:b/>
+          <w:bCs/>
+        </w:rPr>
+        <w:t>not</w:t>
+      </w:r>
+      <w:r>
+        <w:t xml:space="preserve"> to redesign. </w:t>
+      </w:r>
+    </w:p>
+    <w:p>
+      <w:pPr>
+        <w:numPr>
+          <w:ilvl w:val="0"/>
+          <w:numId w:val="49"/>
+        </w:numPr>
+      </w:pPr>
+      <w:r>
+        <w:t xml:space="preserve">What areas are intentionally deferred. </w:t>
+      </w:r>
+    </w:p>
+    <w:p>
+      <w:pPr>
+        <w:numPr>
+          <w:ilvl w:val="0"/>
+          <w:numId w:val="49"/>
+        </w:numPr>
+      </w:pPr>
+      <w:r>
+        <w:t xml:space="preserve">Known risks where a future ChatGPT is likely to make incorrect assumptions. </w:t>
+      </w:r>
+    </w:p>
+    <w:p>
+      <w:pPr>
+        <w:numPr>
+          <w:ilvl w:val="0"/>
+          <w:numId w:val="49"/>
+        </w:numPr>
+      </w:pPr>
+      <w:r>
+        <w:lastRenderedPageBreak/>
+        <w:t xml:space="preserve">Current naming conventions and contracts that must not be broken (for example, vw_ view column order). </w:t>
+      </w:r>
+    </w:p>
+    <w:p>
+      <w:pPr>
+        <w:numPr>
+          <w:ilvl w:val="0"/>
+          <w:numId w:val="49"/>
+        </w:numPr>
+      </w:pPr>
+      <w:r>
+        <w:t xml:space="preserve">Anything that is easier to forget than to rediscover from the code. </w:t>
+      </w:r>
+    </w:p>
+    <w:p>
+      <w:r>
+        <w:t xml:space="preserve">I also want it to be </w:t>
+      </w:r>
+      <w:r>
+        <w:rPr>
+          <w:b/>
+          <w:bCs/>
+        </w:rPr>
+        <w:t>technical</w:t>
+      </w:r>
+      <w:r>
+        <w:t>, not managerial.</w:t>
+      </w:r>
+    </w:p>
+    <w:p/>
+    <w:p>
+      <w:r>
         <w:pict w14:anchorId="7704AD6C">
-          <v:rect id="_x0000_i1119" style="width:0;height:1.5pt" o:hralign="center" o:hrstd="t" o:hr="t" fillcolor="#a0a0a0" stroked="f"/>
+          <v:rect id="_x0000_i1025" style="width:0;height:1.5pt" o:hralign="center" o:hrstd="t" o:hr="t" fillcolor="#a0a0a0" stroked="f"/>
         </w:pict>
       </w:r>
     </w:p>
@@ -131,7 +363,7 @@
     <w:p>
       <w:r>
         <w:pict w14:anchorId="097DF4A9">
-          <v:rect id="_x0000_i1120" style="width:0;height:1.5pt" o:hralign="center" o:hrstd="t" o:hr="t" fillcolor="#a0a0a0" stroked="f"/>
+          <v:rect id="_x0000_i1026" style="width:0;height:1.5pt" o:hralign="center" o:hrstd="t" o:hr="t" fillcolor="#a0a0a0" stroked="f"/>
         </w:pict>
       </w:r>
     </w:p>
@@ -163,7 +395,7 @@
     <w:p>
       <w:r>
         <w:pict w14:anchorId="401FA494">
-          <v:rect id="_x0000_i1121" style="width:0;height:1.5pt" o:hralign="center" o:hrstd="t" o:hr="t" fillcolor="#a0a0a0" stroked="f"/>
+          <v:rect id="_x0000_i1027" style="width:0;height:1.5pt" o:hralign="center" o:hrstd="t" o:hr="t" fillcolor="#a0a0a0" stroked="f"/>
         </w:pict>
       </w:r>
     </w:p>
@@ -233,7 +465,6 @@
         </w:numPr>
       </w:pPr>
       <w:r>
-        <w:lastRenderedPageBreak/>
         <w:t xml:space="preserve">procedure </w:t>
       </w:r>
     </w:p>
@@ -245,6 +476,7 @@
         </w:numPr>
       </w:pPr>
       <w:r>
+        <w:lastRenderedPageBreak/>
         <w:t xml:space="preserve">SQL object </w:t>
       </w:r>
     </w:p>
@@ -267,7 +499,7 @@
     <w:p>
       <w:r>
         <w:pict w14:anchorId="18F9898D">
-          <v:rect id="_x0000_i1122" style="width:0;height:1.5pt" o:hralign="center" o:hrstd="t" o:hr="t" fillcolor="#a0a0a0" stroked="f"/>
+          <v:rect id="_x0000_i1028" style="width:0;height:1.5pt" o:hralign="center" o:hrstd="t" o:hr="t" fillcolor="#a0a0a0" stroked="f"/>
         </w:pict>
       </w:r>
     </w:p>
@@ -370,7 +602,7 @@
     <w:p>
       <w:r>
         <w:pict w14:anchorId="381E9A26">
-          <v:rect id="_x0000_i1123" style="width:0;height:1.5pt" o:hralign="center" o:hrstd="t" o:hr="t" fillcolor="#a0a0a0" stroked="f"/>
+          <v:rect id="_x0000_i1029" style="width:0;height:1.5pt" o:hralign="center" o:hrstd="t" o:hr="t" fillcolor="#a0a0a0" stroked="f"/>
         </w:pict>
       </w:r>
     </w:p>
@@ -412,7 +644,7 @@
     <w:p>
       <w:r>
         <w:pict w14:anchorId="090C78ED">
-          <v:rect id="_x0000_i1124" style="width:0;height:1.5pt" o:hralign="center" o:hrstd="t" o:hr="t" fillcolor="#a0a0a0" stroked="f"/>
+          <v:rect id="_x0000_i1030" style="width:0;height:1.5pt" o:hralign="center" o:hrstd="t" o:hr="t" fillcolor="#a0a0a0" stroked="f"/>
         </w:pict>
       </w:r>
     </w:p>
@@ -448,14 +680,14 @@
     </w:p>
     <w:p>
       <w:r>
+        <w:t>Leave them until their planned implementation phase.</w:t>
+      </w:r>
+    </w:p>
+    <w:p>
+      <w:r>
         <w:lastRenderedPageBreak/>
-        <w:t>Leave them until their planned implementation phase.</w:t>
-      </w:r>
-    </w:p>
-    <w:p>
-      <w:r>
         <w:pict w14:anchorId="3E87DCC3">
-          <v:rect id="_x0000_i1125" style="width:0;height:1.5pt" o:hralign="center" o:hrstd="t" o:hr="t" fillcolor="#a0a0a0" stroked="f"/>
+          <v:rect id="_x0000_i1031" style="width:0;height:1.5pt" o:hralign="center" o:hrstd="t" o:hr="t" fillcolor="#a0a0a0" stroked="f"/>
         </w:pict>
       </w:r>
     </w:p>
@@ -492,7 +724,7 @@
     <w:p>
       <w:r>
         <w:pict w14:anchorId="7D2CF54F">
-          <v:rect id="_x0000_i1126" style="width:0;height:1.5pt" o:hralign="center" o:hrstd="t" o:hr="t" fillcolor="#a0a0a0" stroked="f"/>
+          <v:rect id="_x0000_i1032" style="width:0;height:1.5pt" o:hralign="center" o:hrstd="t" o:hr="t" fillcolor="#a0a0a0" stroked="f"/>
         </w:pict>
       </w:r>
     </w:p>
@@ -557,7 +789,7 @@
     <w:p>
       <w:r>
         <w:pict w14:anchorId="40CBDB0C">
-          <v:rect id="_x0000_i1127" style="width:0;height:1.5pt" o:hralign="center" o:hrstd="t" o:hr="t" fillcolor="#a0a0a0" stroked="f"/>
+          <v:rect id="_x0000_i1033" style="width:0;height:1.5pt" o:hralign="center" o:hrstd="t" o:hr="t" fillcolor="#a0a0a0" stroked="f"/>
         </w:pict>
       </w:r>
     </w:p>
@@ -676,19 +908,19 @@
         </w:numPr>
       </w:pPr>
       <w:r>
+        <w:t xml:space="preserve">Permanent documentation should not duplicate each other. </w:t>
+      </w:r>
+    </w:p>
+    <w:p>
+      <w:r>
         <w:lastRenderedPageBreak/>
-        <w:t xml:space="preserve">Permanent documentation should not duplicate each other. </w:t>
-      </w:r>
-    </w:p>
-    <w:p>
-      <w:r>
         <w:t>This prevents wasting time revisiting settled topics.</w:t>
       </w:r>
     </w:p>
     <w:p>
       <w:r>
         <w:pict w14:anchorId="679F453B">
-          <v:rect id="_x0000_i1128" style="width:0;height:1.5pt" o:hralign="center" o:hrstd="t" o:hr="t" fillcolor="#a0a0a0" stroked="f"/>
+          <v:rect id="_x0000_i1034" style="width:0;height:1.5pt" o:hralign="center" o:hrstd="t" o:hr="t" fillcolor="#a0a0a0" stroked="f"/>
         </w:pict>
       </w:r>
     </w:p>
@@ -704,23 +936,7 @@
           <w:b/>
           <w:bCs/>
         </w:rPr>
-        <w:t xml:space="preserve">Things Not </w:t>
-      </w:r>
-      <w:proofErr w:type="gramStart"/>
-      <w:r>
-        <w:rPr>
-          <w:b/>
-          <w:bCs/>
-        </w:rPr>
-        <w:t>To</w:t>
-      </w:r>
-      <w:proofErr w:type="gramEnd"/>
-      <w:r>
-        <w:rPr>
-          <w:b/>
-          <w:bCs/>
-        </w:rPr>
-        <w:t xml:space="preserve"> Do</w:t>
+        <w:t>Things Not To Do</w:t>
       </w:r>
     </w:p>
     <w:p>
@@ -806,7 +1022,7 @@
     <w:p>
       <w:r>
         <w:pict w14:anchorId="642FDB86">
-          <v:rect id="_x0000_i1129" style="width:0;height:1.5pt" o:hralign="center" o:hrstd="t" o:hr="t" fillcolor="#a0a0a0" stroked="f"/>
+          <v:rect id="_x0000_i1035" style="width:0;height:1.5pt" o:hralign="center" o:hrstd="t" o:hr="t" fillcolor="#a0a0a0" stroked="f"/>
         </w:pict>
       </w:r>
     </w:p>
@@ -930,7 +1146,7 @@
     <w:p>
       <w:r>
         <w:pict w14:anchorId="1B057D85">
-          <v:rect id="_x0000_i1130" style="width:0;height:1.5pt" o:hralign="center" o:hrstd="t" o:hr="t" fillcolor="#a0a0a0" stroked="f"/>
+          <v:rect id="_x0000_i1036" style="width:0;height:1.5pt" o:hralign="center" o:hrstd="t" o:hr="t" fillcolor="#a0a0a0" stroked="f"/>
         </w:pict>
       </w:r>
     </w:p>
@@ -951,12 +1167,12 @@
     </w:p>
     <w:p>
       <w:r>
+        <w:t>Write one instruction only.</w:t>
+      </w:r>
+    </w:p>
+    <w:p>
+      <w:r>
         <w:lastRenderedPageBreak/>
-        <w:t>Write one instruction only.</w:t>
-      </w:r>
-    </w:p>
-    <w:p>
-      <w:r>
         <w:t>Exactly what should be opened first.</w:t>
       </w:r>
     </w:p>
@@ -5464,6 +5680,155 @@
     </w:lvl>
   </w:abstractNum>
   <w:abstractNum w:abstractNumId="31" w15:restartNumberingAfterBreak="0">
+    <w:nsid w:val="4CDC55BE"/>
+    <w:multiLevelType w:val="multilevel"/>
+    <w:tmpl w:val="215E955C"/>
+    <w:lvl w:ilvl="0">
+      <w:start w:val="1"/>
+      <w:numFmt w:val="bullet"/>
+      <w:lvlText w:val=""/>
+      <w:lvlJc w:val="left"/>
+      <w:pPr>
+        <w:tabs>
+          <w:tab w:val="num" w:pos="720"/>
+        </w:tabs>
+        <w:ind w:left="720" w:hanging="360"/>
+      </w:pPr>
+      <w:rPr>
+        <w:rFonts w:ascii="Symbol" w:hAnsi="Symbol" w:hint="default"/>
+        <w:sz w:val="20"/>
+      </w:rPr>
+    </w:lvl>
+    <w:lvl w:ilvl="1" w:tentative="1">
+      <w:start w:val="1"/>
+      <w:numFmt w:val="bullet"/>
+      <w:lvlText w:val="o"/>
+      <w:lvlJc w:val="left"/>
+      <w:pPr>
+        <w:tabs>
+          <w:tab w:val="num" w:pos="1440"/>
+        </w:tabs>
+        <w:ind w:left="1440" w:hanging="360"/>
+      </w:pPr>
+      <w:rPr>
+        <w:rFonts w:ascii="Courier New" w:hAnsi="Courier New" w:hint="default"/>
+        <w:sz w:val="20"/>
+      </w:rPr>
+    </w:lvl>
+    <w:lvl w:ilvl="2" w:tentative="1">
+      <w:start w:val="1"/>
+      <w:numFmt w:val="bullet"/>
+      <w:lvlText w:val=""/>
+      <w:lvlJc w:val="left"/>
+      <w:pPr>
+        <w:tabs>
+          <w:tab w:val="num" w:pos="2160"/>
+        </w:tabs>
+        <w:ind w:left="2160" w:hanging="360"/>
+      </w:pPr>
+      <w:rPr>
+        <w:rFonts w:ascii="Wingdings" w:hAnsi="Wingdings" w:hint="default"/>
+        <w:sz w:val="20"/>
+      </w:rPr>
+    </w:lvl>
+    <w:lvl w:ilvl="3" w:tentative="1">
+      <w:start w:val="1"/>
+      <w:numFmt w:val="bullet"/>
+      <w:lvlText w:val=""/>
+      <w:lvlJc w:val="left"/>
+      <w:pPr>
+        <w:tabs>
+          <w:tab w:val="num" w:pos="2880"/>
+        </w:tabs>
+        <w:ind w:left="2880" w:hanging="360"/>
+      </w:pPr>
+      <w:rPr>
+        <w:rFonts w:ascii="Wingdings" w:hAnsi="Wingdings" w:hint="default"/>
+        <w:sz w:val="20"/>
+      </w:rPr>
+    </w:lvl>
+    <w:lvl w:ilvl="4" w:tentative="1">
+      <w:start w:val="1"/>
+      <w:numFmt w:val="bullet"/>
+      <w:lvlText w:val=""/>
+      <w:lvlJc w:val="left"/>
+      <w:pPr>
+        <w:tabs>
+          <w:tab w:val="num" w:pos="3600"/>
+        </w:tabs>
+        <w:ind w:left="3600" w:hanging="360"/>
+      </w:pPr>
+      <w:rPr>
+        <w:rFonts w:ascii="Wingdings" w:hAnsi="Wingdings" w:hint="default"/>
+        <w:sz w:val="20"/>
+      </w:rPr>
+    </w:lvl>
+    <w:lvl w:ilvl="5" w:tentative="1">
+      <w:start w:val="1"/>
+      <w:numFmt w:val="bullet"/>
+      <w:lvlText w:val=""/>
+      <w:lvlJc w:val="left"/>
+      <w:pPr>
+        <w:tabs>
+          <w:tab w:val="num" w:pos="4320"/>
+        </w:tabs>
+        <w:ind w:left="4320" w:hanging="360"/>
+      </w:pPr>
+      <w:rPr>
+        <w:rFonts w:ascii="Wingdings" w:hAnsi="Wingdings" w:hint="default"/>
+        <w:sz w:val="20"/>
+      </w:rPr>
+    </w:lvl>
+    <w:lvl w:ilvl="6" w:tentative="1">
+      <w:start w:val="1"/>
+      <w:numFmt w:val="bullet"/>
+      <w:lvlText w:val=""/>
+      <w:lvlJc w:val="left"/>
+      <w:pPr>
+        <w:tabs>
+          <w:tab w:val="num" w:pos="5040"/>
+        </w:tabs>
+        <w:ind w:left="5040" w:hanging="360"/>
+      </w:pPr>
+      <w:rPr>
+        <w:rFonts w:ascii="Wingdings" w:hAnsi="Wingdings" w:hint="default"/>
+        <w:sz w:val="20"/>
+      </w:rPr>
+    </w:lvl>
+    <w:lvl w:ilvl="7" w:tentative="1">
+      <w:start w:val="1"/>
+      <w:numFmt w:val="bullet"/>
+      <w:lvlText w:val=""/>
+      <w:lvlJc w:val="left"/>
+      <w:pPr>
+        <w:tabs>
+          <w:tab w:val="num" w:pos="5760"/>
+        </w:tabs>
+        <w:ind w:left="5760" w:hanging="360"/>
+      </w:pPr>
+      <w:rPr>
+        <w:rFonts w:ascii="Wingdings" w:hAnsi="Wingdings" w:hint="default"/>
+        <w:sz w:val="20"/>
+      </w:rPr>
+    </w:lvl>
+    <w:lvl w:ilvl="8" w:tentative="1">
+      <w:start w:val="1"/>
+      <w:numFmt w:val="bullet"/>
+      <w:lvlText w:val=""/>
+      <w:lvlJc w:val="left"/>
+      <w:pPr>
+        <w:tabs>
+          <w:tab w:val="num" w:pos="6480"/>
+        </w:tabs>
+        <w:ind w:left="6480" w:hanging="360"/>
+      </w:pPr>
+      <w:rPr>
+        <w:rFonts w:ascii="Wingdings" w:hAnsi="Wingdings" w:hint="default"/>
+        <w:sz w:val="20"/>
+      </w:rPr>
+    </w:lvl>
+  </w:abstractNum>
+  <w:abstractNum w:abstractNumId="32" w15:restartNumberingAfterBreak="0">
     <w:nsid w:val="50273572"/>
     <w:multiLevelType w:val="multilevel"/>
     <w:tmpl w:val="1462655A"/>
@@ -5612,7 +5977,7 @@
       </w:rPr>
     </w:lvl>
   </w:abstractNum>
-  <w:abstractNum w:abstractNumId="32" w15:restartNumberingAfterBreak="0">
+  <w:abstractNum w:abstractNumId="33" w15:restartNumberingAfterBreak="0">
     <w:nsid w:val="506A3192"/>
     <w:multiLevelType w:val="multilevel"/>
     <w:tmpl w:val="E5D25E62"/>
@@ -5761,7 +6126,7 @@
       </w:rPr>
     </w:lvl>
   </w:abstractNum>
-  <w:abstractNum w:abstractNumId="33" w15:restartNumberingAfterBreak="0">
+  <w:abstractNum w:abstractNumId="34" w15:restartNumberingAfterBreak="0">
     <w:nsid w:val="52C04A51"/>
     <w:multiLevelType w:val="multilevel"/>
     <w:tmpl w:val="A9BAF1A0"/>
@@ -5910,7 +6275,7 @@
       </w:rPr>
     </w:lvl>
   </w:abstractNum>
-  <w:abstractNum w:abstractNumId="34" w15:restartNumberingAfterBreak="0">
+  <w:abstractNum w:abstractNumId="35" w15:restartNumberingAfterBreak="0">
     <w:nsid w:val="552E0635"/>
     <w:multiLevelType w:val="multilevel"/>
     <w:tmpl w:val="AA949986"/>
@@ -6059,7 +6424,7 @@
       </w:rPr>
     </w:lvl>
   </w:abstractNum>
-  <w:abstractNum w:abstractNumId="35" w15:restartNumberingAfterBreak="0">
+  <w:abstractNum w:abstractNumId="36" w15:restartNumberingAfterBreak="0">
     <w:nsid w:val="5A650D1B"/>
     <w:multiLevelType w:val="multilevel"/>
     <w:tmpl w:val="06D09F86"/>
@@ -6172,7 +6537,7 @@
       </w:pPr>
     </w:lvl>
   </w:abstractNum>
-  <w:abstractNum w:abstractNumId="36" w15:restartNumberingAfterBreak="0">
+  <w:abstractNum w:abstractNumId="37" w15:restartNumberingAfterBreak="0">
     <w:nsid w:val="5DFE1149"/>
     <w:multiLevelType w:val="multilevel"/>
     <w:tmpl w:val="9FECCC4C"/>
@@ -6321,7 +6686,7 @@
       </w:rPr>
     </w:lvl>
   </w:abstractNum>
-  <w:abstractNum w:abstractNumId="37" w15:restartNumberingAfterBreak="0">
+  <w:abstractNum w:abstractNumId="38" w15:restartNumberingAfterBreak="0">
     <w:nsid w:val="5FB209AF"/>
     <w:multiLevelType w:val="multilevel"/>
     <w:tmpl w:val="7D3262AE"/>
@@ -6434,7 +6799,7 @@
       </w:pPr>
     </w:lvl>
   </w:abstractNum>
-  <w:abstractNum w:abstractNumId="38" w15:restartNumberingAfterBreak="0">
+  <w:abstractNum w:abstractNumId="39" w15:restartNumberingAfterBreak="0">
     <w:nsid w:val="60BD7E99"/>
     <w:multiLevelType w:val="multilevel"/>
     <w:tmpl w:val="15083710"/>
@@ -6583,7 +6948,7 @@
       </w:rPr>
     </w:lvl>
   </w:abstractNum>
-  <w:abstractNum w:abstractNumId="39" w15:restartNumberingAfterBreak="0">
+  <w:abstractNum w:abstractNumId="40" w15:restartNumberingAfterBreak="0">
     <w:nsid w:val="64485EBF"/>
     <w:multiLevelType w:val="multilevel"/>
     <w:tmpl w:val="29309584"/>
@@ -6696,7 +7061,7 @@
       </w:pPr>
     </w:lvl>
   </w:abstractNum>
-  <w:abstractNum w:abstractNumId="40" w15:restartNumberingAfterBreak="0">
+  <w:abstractNum w:abstractNumId="41" w15:restartNumberingAfterBreak="0">
     <w:nsid w:val="658437F5"/>
     <w:multiLevelType w:val="multilevel"/>
     <w:tmpl w:val="FBF210AA"/>
@@ -6845,7 +7210,7 @@
       </w:rPr>
     </w:lvl>
   </w:abstractNum>
-  <w:abstractNum w:abstractNumId="41" w15:restartNumberingAfterBreak="0">
+  <w:abstractNum w:abstractNumId="42" w15:restartNumberingAfterBreak="0">
     <w:nsid w:val="68FC47AA"/>
     <w:multiLevelType w:val="multilevel"/>
     <w:tmpl w:val="27B80E76"/>
@@ -6994,7 +7359,7 @@
       </w:rPr>
     </w:lvl>
   </w:abstractNum>
-  <w:abstractNum w:abstractNumId="42" w15:restartNumberingAfterBreak="0">
+  <w:abstractNum w:abstractNumId="43" w15:restartNumberingAfterBreak="0">
     <w:nsid w:val="6A5472E8"/>
     <w:multiLevelType w:val="multilevel"/>
     <w:tmpl w:val="DC72B916"/>
@@ -7143,7 +7508,7 @@
       </w:rPr>
     </w:lvl>
   </w:abstractNum>
-  <w:abstractNum w:abstractNumId="43" w15:restartNumberingAfterBreak="0">
+  <w:abstractNum w:abstractNumId="44" w15:restartNumberingAfterBreak="0">
     <w:nsid w:val="6B637971"/>
     <w:multiLevelType w:val="multilevel"/>
     <w:tmpl w:val="77709FE2"/>
@@ -7292,7 +7657,7 @@
       </w:rPr>
     </w:lvl>
   </w:abstractNum>
-  <w:abstractNum w:abstractNumId="44" w15:restartNumberingAfterBreak="0">
+  <w:abstractNum w:abstractNumId="45" w15:restartNumberingAfterBreak="0">
     <w:nsid w:val="73D6175F"/>
     <w:multiLevelType w:val="multilevel"/>
     <w:tmpl w:val="9E72E7DA"/>
@@ -7441,7 +7806,7 @@
       </w:rPr>
     </w:lvl>
   </w:abstractNum>
-  <w:abstractNum w:abstractNumId="45" w15:restartNumberingAfterBreak="0">
+  <w:abstractNum w:abstractNumId="46" w15:restartNumberingAfterBreak="0">
     <w:nsid w:val="758F4550"/>
     <w:multiLevelType w:val="multilevel"/>
     <w:tmpl w:val="A93C16F0"/>
@@ -7590,7 +7955,7 @@
       </w:rPr>
     </w:lvl>
   </w:abstractNum>
-  <w:abstractNum w:abstractNumId="46" w15:restartNumberingAfterBreak="0">
+  <w:abstractNum w:abstractNumId="47" w15:restartNumberingAfterBreak="0">
     <w:nsid w:val="77676B2D"/>
     <w:multiLevelType w:val="multilevel"/>
     <w:tmpl w:val="C61CD5B4"/>
@@ -7739,7 +8104,7 @@
       </w:rPr>
     </w:lvl>
   </w:abstractNum>
-  <w:abstractNum w:abstractNumId="47" w15:restartNumberingAfterBreak="0">
+  <w:abstractNum w:abstractNumId="48" w15:restartNumberingAfterBreak="0">
     <w:nsid w:val="7FD2010B"/>
     <w:multiLevelType w:val="multilevel"/>
     <w:tmpl w:val="4A1EBC78"/>
@@ -7892,7 +8257,7 @@
     <w:abstractNumId w:val="7"/>
   </w:num>
   <w:num w:numId="2" w16cid:durableId="347831007">
-    <w:abstractNumId w:val="34"/>
+    <w:abstractNumId w:val="35"/>
   </w:num>
   <w:num w:numId="3" w16cid:durableId="1281106764">
     <w:abstractNumId w:val="8"/>
@@ -7907,7 +8272,7 @@
     <w:abstractNumId w:val="0"/>
   </w:num>
   <w:num w:numId="7" w16cid:durableId="317463281">
-    <w:abstractNumId w:val="33"/>
+    <w:abstractNumId w:val="34"/>
   </w:num>
   <w:num w:numId="8" w16cid:durableId="135808055">
     <w:abstractNumId w:val="17"/>
@@ -7922,10 +8287,10 @@
     <w:abstractNumId w:val="20"/>
   </w:num>
   <w:num w:numId="12" w16cid:durableId="599727215">
-    <w:abstractNumId w:val="45"/>
+    <w:abstractNumId w:val="46"/>
   </w:num>
   <w:num w:numId="13" w16cid:durableId="2089381245">
-    <w:abstractNumId w:val="47"/>
+    <w:abstractNumId w:val="48"/>
   </w:num>
   <w:num w:numId="14" w16cid:durableId="1768039287">
     <w:abstractNumId w:val="6"/>
@@ -7937,25 +8302,25 @@
     <w:abstractNumId w:val="1"/>
   </w:num>
   <w:num w:numId="17" w16cid:durableId="1244296031">
-    <w:abstractNumId w:val="40"/>
+    <w:abstractNumId w:val="41"/>
   </w:num>
   <w:num w:numId="18" w16cid:durableId="650915016">
-    <w:abstractNumId w:val="39"/>
+    <w:abstractNumId w:val="40"/>
   </w:num>
   <w:num w:numId="19" w16cid:durableId="1559364453">
     <w:abstractNumId w:val="12"/>
   </w:num>
   <w:num w:numId="20" w16cid:durableId="486944361">
-    <w:abstractNumId w:val="37"/>
+    <w:abstractNumId w:val="38"/>
   </w:num>
   <w:num w:numId="21" w16cid:durableId="1258707212">
     <w:abstractNumId w:val="21"/>
   </w:num>
   <w:num w:numId="22" w16cid:durableId="645666773">
-    <w:abstractNumId w:val="35"/>
+    <w:abstractNumId w:val="36"/>
   </w:num>
   <w:num w:numId="23" w16cid:durableId="218129669">
-    <w:abstractNumId w:val="44"/>
+    <w:abstractNumId w:val="45"/>
   </w:num>
   <w:num w:numId="24" w16cid:durableId="334656007">
     <w:abstractNumId w:val="19"/>
@@ -7973,7 +8338,7 @@
     <w:abstractNumId w:val="15"/>
   </w:num>
   <w:num w:numId="29" w16cid:durableId="2033528134">
-    <w:abstractNumId w:val="42"/>
+    <w:abstractNumId w:val="43"/>
   </w:num>
   <w:num w:numId="30" w16cid:durableId="1408771983">
     <w:abstractNumId w:val="10"/>
@@ -7982,7 +8347,7 @@
     <w:abstractNumId w:val="30"/>
   </w:num>
   <w:num w:numId="32" w16cid:durableId="186219323">
-    <w:abstractNumId w:val="43"/>
+    <w:abstractNumId w:val="44"/>
   </w:num>
   <w:num w:numId="33" w16cid:durableId="996884649">
     <w:abstractNumId w:val="28"/>
@@ -7994,22 +8359,22 @@
     <w:abstractNumId w:val="5"/>
   </w:num>
   <w:num w:numId="36" w16cid:durableId="1405376479">
-    <w:abstractNumId w:val="38"/>
+    <w:abstractNumId w:val="39"/>
   </w:num>
   <w:num w:numId="37" w16cid:durableId="2061972595">
-    <w:abstractNumId w:val="36"/>
+    <w:abstractNumId w:val="37"/>
   </w:num>
   <w:num w:numId="38" w16cid:durableId="1461798964">
-    <w:abstractNumId w:val="31"/>
+    <w:abstractNumId w:val="32"/>
   </w:num>
   <w:num w:numId="39" w16cid:durableId="1695765471">
     <w:abstractNumId w:val="14"/>
   </w:num>
   <w:num w:numId="40" w16cid:durableId="523323098">
-    <w:abstractNumId w:val="41"/>
+    <w:abstractNumId w:val="42"/>
   </w:num>
   <w:num w:numId="41" w16cid:durableId="902718024">
-    <w:abstractNumId w:val="32"/>
+    <w:abstractNumId w:val="33"/>
   </w:num>
   <w:num w:numId="42" w16cid:durableId="1504130756">
     <w:abstractNumId w:val="3"/>
@@ -8024,13 +8389,16 @@
     <w:abstractNumId w:val="4"/>
   </w:num>
   <w:num w:numId="46" w16cid:durableId="2098596498">
-    <w:abstractNumId w:val="46"/>
+    <w:abstractNumId w:val="47"/>
   </w:num>
   <w:num w:numId="47" w16cid:durableId="1021124269">
     <w:abstractNumId w:val="26"/>
   </w:num>
   <w:num w:numId="48" w16cid:durableId="363294346">
     <w:abstractNumId w:val="2"/>
+  </w:num>
+  <w:num w:numId="49" w16cid:durableId="797836868">
+    <w:abstractNumId w:val="31"/>
   </w:num>
   <w:numIdMacAtCleanup w:val="16"/>
 </w:numbering>

</xml_diff>